<commit_message>
correction gui for rapid cns2
</commit_message>
<xml_diff>
--- a/trunk/docs/NanoPoreSeq_guide_utilisateur_FR.docx
+++ b/trunk/docs/NanoPoreSeq_guide_utilisateur_FR.docx
@@ -65,7 +65,7 @@
           <w:sz w:val="19"/>
           <w:szCs w:val="19"/>
         </w:rPr>
-        <w:t xml:space="preserve">Version du 26 octobre 2026 · scripts des dossiers simulation/, rapidcns2/ et usb/</w:t>
+        <w:t xml:space="preserve">Version du 26 octobre 2026 (2) · scripts des dossiers simulation/, rapidcns2/ et usb/</w:t>
       </w:r>
     </w:p>
     <w:p>
@@ -2176,6 +2176,34 @@
       <w:pPr>
         <w:spacing w:after="100"/>
       </w:pPr>
+    </w:p>
+    <w:p>
+      <w:pPr>
+        <w:pBdr>
+          <w:left w:val="single" w:color="E39B2B" w:sz="18" w:space="6"/>
+        </w:pBdr>
+        <w:shd w:fill="FFF4E0" w:color="auto" w:val="clear"/>
+        <w:spacing w:after="160" w:before="60" w:line="276"/>
+        <w:ind w:left="120" w:right="120"/>
+      </w:pPr>
+      <w:r>
+        <w:rPr>
+          <w:rFonts w:ascii="Arial" w:cs="Arial" w:eastAsia="Arial" w:hAnsi="Arial"/>
+          <w:b/>
+          <w:bCs/>
+          <w:sz w:val="21"/>
+          <w:szCs w:val="21"/>
+        </w:rPr>
+        <w:t xml:space="preserve">À noter : </w:t>
+      </w:r>
+      <w:r>
+        <w:rPr>
+          <w:rFonts w:ascii="Arial" w:cs="Arial" w:eastAsia="Arial" w:hAnsi="Arial"/>
+          <w:sz w:val="21"/>
+          <w:szCs w:val="21"/>
+        </w:rPr>
+        <w:t xml:space="preserve">Nextflow 26.04 et plus analyse les fichiers avec une syntaxe stricte que Rapid-CNS2_nf 3.0 ne respecte pas encore (erreur « Unexpected input: 'java' » au démarrage). L'interface Rapid-CNS2 et la clé USB règlent automatiquement NXF_SYNTAX_PARSER=v1 (ancien analyseur) ; en ligne de commande, faire export NXF_SYNTAX_PARSER=v1 avant nextflow run.</w:t>
+      </w:r>
     </w:p>
     <w:p>
       <w:pPr>
@@ -20054,7 +20082,7 @@
                 <w:sz w:val="17"/>
                 <w:szCs w:val="17"/>
               </w:rPr>
-              <w:t xml:space="preserve">the stick is formatted as '…'</w:t>
+              <w:t xml:space="preserve">Config parsing failed / Unexpected input: 'java'</w:t>
             </w:r>
           </w:p>
         </w:tc>
@@ -20086,7 +20114,7 @@
                 <w:sz w:val="17"/>
                 <w:szCs w:val="17"/>
               </w:rPr>
-              <w:t xml:space="preserve">clé en FAT32 ou exFAT</w:t>
+              <w:t xml:space="preserve">Nextflow ≥ 26.04 : syntaxe stricte, pas encore suivie par Rapid-CNS2_nf 3.0</w:t>
             </w:r>
           </w:p>
         </w:tc>
@@ -20118,7 +20146,7 @@
                 <w:sz w:val="17"/>
                 <w:szCs w:val="17"/>
               </w:rPr>
-              <w:t xml:space="preserve">reformater en ext4 (section 6.8)</w:t>
+              <w:t xml:space="preserve">export NXF_SYNTAX_PARSER=v1 (automatique dans l'interface et sur la clé)</w:t>
             </w:r>
           </w:p>
         </w:tc>
@@ -20156,7 +20184,7 @@
                 <w:sz w:val="17"/>
                 <w:szCs w:val="17"/>
               </w:rPr>
-              <w:t xml:space="preserve">… is mounted on '…': … is used by the system</w:t>
+              <w:t xml:space="preserve">the stick is formatted as '…'</w:t>
             </w:r>
           </w:p>
         </w:tc>
@@ -20189,7 +20217,7 @@
                 <w:sz w:val="17"/>
                 <w:szCs w:val="17"/>
               </w:rPr>
-              <w:t xml:space="preserve">disque système ou partition montée hors de /media</w:t>
+              <w:t xml:space="preserve">clé en FAT32 ou exFAT</w:t>
             </w:r>
           </w:p>
         </w:tc>
@@ -20222,7 +20250,7 @@
                 <w:sz w:val="17"/>
                 <w:szCs w:val="17"/>
               </w:rPr>
-              <w:t xml:space="preserve">vérifier le nom avec --list ; démonter la clé si elle est montée ailleurs</w:t>
+              <w:t xml:space="preserve">reformater en ext4 (section 6.8)</w:t>
             </w:r>
           </w:p>
         </w:tc>
@@ -20259,7 +20287,7 @@
                 <w:sz w:val="17"/>
                 <w:szCs w:val="17"/>
               </w:rPr>
-              <w:t xml:space="preserve">… is neither USB nor removable</w:t>
+              <w:t xml:space="preserve">… is mounted on '…': … is used by the system</w:t>
             </w:r>
           </w:p>
         </w:tc>
@@ -20291,7 +20319,7 @@
                 <w:sz w:val="17"/>
                 <w:szCs w:val="17"/>
               </w:rPr>
-              <w:t xml:space="preserve">boîtier non signalé comme amovible</w:t>
+              <w:t xml:space="preserve">disque système ou partition montée hors de /media</w:t>
             </w:r>
           </w:p>
         </w:tc>
@@ -20323,7 +20351,7 @@
                 <w:sz w:val="17"/>
                 <w:szCs w:val="17"/>
               </w:rPr>
-              <w:t xml:space="preserve">vérifier que c'est bien la clé, puis --allow-non-removable</w:t>
+              <w:t xml:space="preserve">vérifier le nom avec --list ; démonter la clé si elle est montée ailleurs</w:t>
             </w:r>
           </w:p>
         </w:tc>
@@ -20361,7 +20389,7 @@
                 <w:sz w:val="17"/>
                 <w:szCs w:val="17"/>
               </w:rPr>
-              <w:t xml:space="preserve">… is a folder, not a mount point</w:t>
+              <w:t xml:space="preserve">… is neither USB nor removable</w:t>
             </w:r>
           </w:p>
         </w:tc>
@@ -20394,7 +20422,7 @@
                 <w:sz w:val="17"/>
                 <w:szCs w:val="17"/>
               </w:rPr>
-              <w:t xml:space="preserve">dossier qui n'est pas le point de montage d'une clé</w:t>
+              <w:t xml:space="preserve">boîtier non signalé comme amovible</w:t>
             </w:r>
           </w:p>
         </w:tc>
@@ -20427,7 +20455,7 @@
                 <w:sz w:val="17"/>
                 <w:szCs w:val="17"/>
               </w:rPr>
-              <w:t xml:space="preserve">donner le périphérique (--list) ou le dossier où la clé est montée</w:t>
+              <w:t xml:space="preserve">vérifier que c'est bien la clé, puis --allow-non-removable</w:t>
             </w:r>
           </w:p>
         </w:tc>
@@ -20464,7 +20492,7 @@
                 <w:sz w:val="17"/>
                 <w:szCs w:val="17"/>
               </w:rPr>
-              <w:t xml:space="preserve">no terminal to confirm</w:t>
+              <w:t xml:space="preserve">… is a folder, not a mount point</w:t>
             </w:r>
           </w:p>
         </w:tc>
@@ -20496,7 +20524,7 @@
                 <w:sz w:val="17"/>
                 <w:szCs w:val="17"/>
               </w:rPr>
-              <w:t xml:space="preserve">lancé sans terminal (script, cron)</w:t>
+              <w:t xml:space="preserve">dossier qui n'est pas le point de montage d'une clé</w:t>
             </w:r>
           </w:p>
         </w:tc>
@@ -20528,7 +20556,7 @@
                 <w:sz w:val="17"/>
                 <w:szCs w:val="17"/>
               </w:rPr>
-              <w:t xml:space="preserve">ajouter --yes</w:t>
+              <w:t xml:space="preserve">donner le périphérique (--list) ou le dossier où la clé est montée</w:t>
             </w:r>
           </w:p>
         </w:tc>
@@ -20566,7 +20594,7 @@
                 <w:sz w:val="17"/>
                 <w:szCs w:val="17"/>
               </w:rPr>
-              <w:t xml:space="preserve">ANNOVAR database missing or still compressed</w:t>
+              <w:t xml:space="preserve">no terminal to confirm</w:t>
             </w:r>
           </w:p>
         </w:tc>
@@ -20599,7 +20627,7 @@
                 <w:sz w:val="17"/>
                 <w:szCs w:val="17"/>
               </w:rPr>
-              <w:t xml:space="preserve">base ANNOVAR absente ou encore compressée</w:t>
+              <w:t xml:space="preserve">lancé sans terminal (script, cron)</w:t>
             </w:r>
           </w:p>
         </w:tc>
@@ -20632,7 +20660,7 @@
                 <w:sz w:val="17"/>
                 <w:szCs w:val="17"/>
               </w:rPr>
-              <w:t xml:space="preserve">décompresser les bases ou utiliser --no-annovar</w:t>
+              <w:t xml:space="preserve">ajouter --yes</w:t>
             </w:r>
           </w:p>
         </w:tc>
@@ -20663,13 +20691,13 @@
             </w:pPr>
             <w:r>
               <w:rPr>
-                <w:rFonts w:ascii="Arial" w:cs="Arial" w:eastAsia="Arial" w:hAnsi="Arial"/>
-                <w:b w:val="false"/>
-                <w:bCs w:val="false"/>
-                <w:sz w:val="17"/>
-                <w:szCs w:val="17"/>
-              </w:rPr>
-              <w:t xml:space="preserve">run.sh --check : ✘ usable container engine</w:t>
+                <w:rFonts w:ascii="Consolas" w:cs="Consolas" w:eastAsia="Consolas" w:hAnsi="Consolas"/>
+                <w:b w:val="false"/>
+                <w:bCs w:val="false"/>
+                <w:sz w:val="17"/>
+                <w:szCs w:val="17"/>
+              </w:rPr>
+              <w:t xml:space="preserve">ANNOVAR database missing or still compressed</w:t>
             </w:r>
           </w:p>
         </w:tc>
@@ -20701,7 +20729,7 @@
                 <w:sz w:val="17"/>
                 <w:szCs w:val="17"/>
               </w:rPr>
-              <w:t xml:space="preserve">ni Apptainer ni Docker sur l'hôte</w:t>
+              <w:t xml:space="preserve">base ANNOVAR absente ou encore compressée</w:t>
             </w:r>
           </w:p>
         </w:tc>
@@ -20733,7 +20761,7 @@
                 <w:sz w:val="17"/>
                 <w:szCs w:val="17"/>
               </w:rPr>
-              <w:t xml:space="preserve">installer l'un des deux ; forcer avec RCNS_ENGINE si besoin</w:t>
+              <w:t xml:space="preserve">décompresser les bases ou utiliser --no-annovar</w:t>
             </w:r>
           </w:p>
         </w:tc>
@@ -20765,13 +20793,13 @@
             </w:pPr>
             <w:r>
               <w:rPr>
-                <w:rFonts w:ascii="Consolas" w:cs="Consolas" w:eastAsia="Consolas" w:hAnsi="Consolas"/>
-                <w:b w:val="false"/>
-                <w:bCs w:val="false"/>
-                <w:sz w:val="17"/>
-                <w:szCs w:val="17"/>
-              </w:rPr>
-              <w:t xml:space="preserve">no MM:Z: tag in the FASTQ headers</w:t>
+                <w:rFonts w:ascii="Arial" w:cs="Arial" w:eastAsia="Arial" w:hAnsi="Arial"/>
+                <w:b w:val="false"/>
+                <w:bCs w:val="false"/>
+                <w:sz w:val="17"/>
+                <w:szCs w:val="17"/>
+              </w:rPr>
+              <w:t xml:space="preserve">run.sh --check : ✘ usable container engine</w:t>
             </w:r>
           </w:p>
         </w:tc>
@@ -20804,7 +20832,7 @@
                 <w:sz w:val="17"/>
                 <w:szCs w:val="17"/>
               </w:rPr>
-              <w:t xml:space="preserve">FASTQ sans méthylation</w:t>
+              <w:t xml:space="preserve">ni Apptainer ni Docker sur l'hôte</w:t>
             </w:r>
           </w:p>
         </w:tc>
@@ -20837,7 +20865,7 @@
                 <w:sz w:val="17"/>
                 <w:szCs w:val="17"/>
               </w:rPr>
-              <w:t xml:space="preserve">repartir des POD5 ou du BAM non aligné</w:t>
+              <w:t xml:space="preserve">installer l'un des deux ; forcer avec RCNS_ENGINE si besoin</w:t>
             </w:r>
           </w:p>
         </w:tc>
@@ -20874,6 +20902,108 @@
                 <w:sz w:val="17"/>
                 <w:szCs w:val="17"/>
               </w:rPr>
+              <w:t xml:space="preserve">no MM:Z: tag in the FASTQ headers</w:t>
+            </w:r>
+          </w:p>
+        </w:tc>
+        <w:tc>
+          <w:tcPr>
+            <w:tcW w:type="dxa" w:w="3000"/>
+            <w:tcBorders>
+              <w:top w:val="single" w:color="BFBFBF" w:sz="4"/>
+              <w:left w:val="single" w:color="BFBFBF" w:sz="4"/>
+              <w:bottom w:val="single" w:color="BFBFBF" w:sz="4"/>
+              <w:right w:val="single" w:color="BFBFBF" w:sz="4"/>
+            </w:tcBorders>
+            <w:tcMar>
+              <w:top w:type="dxa" w:w="60"/>
+              <w:left w:type="dxa" w:w="100"/>
+              <w:bottom w:type="dxa" w:w="60"/>
+              <w:right w:type="dxa" w:w="100"/>
+            </w:tcMar>
+          </w:tcPr>
+          <w:p>
+            <w:pPr>
+              <w:spacing w:after="0" w:line="252"/>
+            </w:pPr>
+            <w:r>
+              <w:rPr>
+                <w:rFonts w:ascii="Arial" w:cs="Arial" w:eastAsia="Arial" w:hAnsi="Arial"/>
+                <w:b w:val="false"/>
+                <w:bCs w:val="false"/>
+                <w:sz w:val="17"/>
+                <w:szCs w:val="17"/>
+              </w:rPr>
+              <w:t xml:space="preserve">FASTQ sans méthylation</w:t>
+            </w:r>
+          </w:p>
+        </w:tc>
+        <w:tc>
+          <w:tcPr>
+            <w:tcW w:type="dxa" w:w="3338"/>
+            <w:tcBorders>
+              <w:top w:val="single" w:color="BFBFBF" w:sz="4"/>
+              <w:left w:val="single" w:color="BFBFBF" w:sz="4"/>
+              <w:bottom w:val="single" w:color="BFBFBF" w:sz="4"/>
+              <w:right w:val="single" w:color="BFBFBF" w:sz="4"/>
+            </w:tcBorders>
+            <w:tcMar>
+              <w:top w:type="dxa" w:w="60"/>
+              <w:left w:type="dxa" w:w="100"/>
+              <w:bottom w:type="dxa" w:w="60"/>
+              <w:right w:type="dxa" w:w="100"/>
+            </w:tcMar>
+          </w:tcPr>
+          <w:p>
+            <w:pPr>
+              <w:spacing w:after="0" w:line="252"/>
+            </w:pPr>
+            <w:r>
+              <w:rPr>
+                <w:rFonts w:ascii="Arial" w:cs="Arial" w:eastAsia="Arial" w:hAnsi="Arial"/>
+                <w:b w:val="false"/>
+                <w:bCs w:val="false"/>
+                <w:sz w:val="17"/>
+                <w:szCs w:val="17"/>
+              </w:rPr>
+              <w:t xml:space="preserve">repartir des POD5 ou du BAM non aligné</w:t>
+            </w:r>
+          </w:p>
+        </w:tc>
+      </w:tr>
+      <w:tr>
+        <w:trPr>
+          <w:cantSplit/>
+        </w:trPr>
+        <w:tc>
+          <w:tcPr>
+            <w:tcW w:type="dxa" w:w="3300"/>
+            <w:tcBorders>
+              <w:top w:val="single" w:color="BFBFBF" w:sz="4"/>
+              <w:left w:val="single" w:color="BFBFBF" w:sz="4"/>
+              <w:bottom w:val="single" w:color="BFBFBF" w:sz="4"/>
+              <w:right w:val="single" w:color="BFBFBF" w:sz="4"/>
+            </w:tcBorders>
+            <w:shd w:fill="F5F7FA" w:color="auto" w:val="clear"/>
+            <w:tcMar>
+              <w:top w:type="dxa" w:w="60"/>
+              <w:left w:type="dxa" w:w="100"/>
+              <w:bottom w:type="dxa" w:w="60"/>
+              <w:right w:type="dxa" w:w="100"/>
+            </w:tcMar>
+          </w:tcPr>
+          <w:p>
+            <w:pPr>
+              <w:spacing w:after="0" w:line="252"/>
+            </w:pPr>
+            <w:r>
+              <w:rPr>
+                <w:rFonts w:ascii="Consolas" w:cs="Consolas" w:eastAsia="Consolas" w:hAnsi="Consolas"/>
+                <w:b w:val="false"/>
+                <w:bCs w:val="false"/>
+                <w:sz w:val="17"/>
+                <w:szCs w:val="17"/>
+              </w:rPr>
               <w:t xml:space="preserve">contig 'chr7' missing</w:t>
             </w:r>
           </w:p>
@@ -20887,6 +21017,7 @@
               <w:bottom w:val="single" w:color="BFBFBF" w:sz="4"/>
               <w:right w:val="single" w:color="BFBFBF" w:sz="4"/>
             </w:tcBorders>
+            <w:shd w:fill="F5F7FA" w:color="auto" w:val="clear"/>
             <w:tcMar>
               <w:top w:type="dxa" w:w="60"/>
               <w:left w:type="dxa" w:w="100"/>
@@ -20919,6 +21050,7 @@
               <w:bottom w:val="single" w:color="BFBFBF" w:sz="4"/>
               <w:right w:val="single" w:color="BFBFBF" w:sz="4"/>
             </w:tcBorders>
+            <w:shd w:fill="F5F7FA" w:color="auto" w:val="clear"/>
             <w:tcMar>
               <w:top w:type="dxa" w:w="60"/>
               <w:left w:type="dxa" w:w="100"/>
@@ -32602,6 +32734,57 @@
           <w:szCs w:val="13"/>
         </w:rPr>
         <w:t xml:space="preserve">export NXF_DISABLE_CHECK_LATEST=true</w:t>
+      </w:r>
+    </w:p>
+    <w:p>
+      <w:pPr>
+        <w:keepNext w:val="false"/>
+        <w:keepLines/>
+        <w:shd w:fill="F2F2F2" w:color="auto" w:val="clear"/>
+        <w:spacing w:after="0" w:before="0" w:line="200"/>
+        <w:ind w:left="0"/>
+      </w:pPr>
+      <w:r>
+        <w:rPr>
+          <w:rFonts w:ascii="Consolas" w:cs="Consolas" w:eastAsia="Consolas" w:hAnsi="Consolas"/>
+          <w:sz w:val="13"/>
+          <w:szCs w:val="13"/>
+        </w:rPr>
+        <w:t xml:space="preserve"># Nextflow &gt;= 26.04 uses the strict syntax by default, not yet followed by Rapid-CNS2_nf 3.0:</w:t>
+      </w:r>
+    </w:p>
+    <w:p>
+      <w:pPr>
+        <w:keepNext w:val="false"/>
+        <w:keepLines/>
+        <w:shd w:fill="F2F2F2" w:color="auto" w:val="clear"/>
+        <w:spacing w:after="0" w:before="0" w:line="200"/>
+        <w:ind w:left="0"/>
+      </w:pPr>
+      <w:r>
+        <w:rPr>
+          <w:rFonts w:ascii="Consolas" w:cs="Consolas" w:eastAsia="Consolas" w:hAnsi="Consolas"/>
+          <w:sz w:val="13"/>
+          <w:szCs w:val="13"/>
+        </w:rPr>
+        <w:t xml:space="preserve"># legacy parser unless already set (NXF_SYNTAX_PARSER=v2 once the pipeline is migrated)</w:t>
+      </w:r>
+    </w:p>
+    <w:p>
+      <w:pPr>
+        <w:keepNext w:val="false"/>
+        <w:keepLines/>
+        <w:shd w:fill="F2F2F2" w:color="auto" w:val="clear"/>
+        <w:spacing w:after="0" w:before="0" w:line="200"/>
+        <w:ind w:left="0"/>
+      </w:pPr>
+      <w:r>
+        <w:rPr>
+          <w:rFonts w:ascii="Consolas" w:cs="Consolas" w:eastAsia="Consolas" w:hAnsi="Consolas"/>
+          <w:sz w:val="13"/>
+          <w:szCs w:val="13"/>
+        </w:rPr>
+        <w:t xml:space="preserve">export NXF_SYNTAX_PARSER="\${NXF_SYNTAX_PARSER:-v1}"</w:t>
       </w:r>
     </w:p>
     <w:p>

</xml_diff>

<commit_message>
new correction config file
</commit_message>
<xml_diff>
--- a/trunk/docs/NanoPoreSeq_guide_utilisateur_FR.docx
+++ b/trunk/docs/NanoPoreSeq_guide_utilisateur_FR.docx
@@ -6068,7 +6068,7 @@
           <w:sz w:val="21"/>
           <w:szCs w:val="21"/>
         </w:rPr>
-        <w:t xml:space="preserve">Ouvrir l'interface Rapid-CNS2, choisir le dossier de cohorte et l'échantillon, vérifier les chemins et les options, puis « Run ». « Copy command » donne la commande équivalente pour un terminal.</w:t>
+        <w:t xml:space="preserve">Ouvrir l'interface Rapid-CNS2, choisir le dossier de cohorte et l'échantillon, vérifier les chemins et les options, puis « Run ». « Copy command » donne la commande équivalente pour un terminal. L'interface monte automatiquement les dossiers AnnotSV et ANNOVAR dans les conteneurs (--containerBindPaths) ; RCNS_BINDPATHS permet d'en ajouter d'autres, séparés par des virgules.</w:t>
       </w:r>
     </w:p>
     <w:p>
@@ -20082,7 +20082,7 @@
                 <w:sz w:val="17"/>
                 <w:szCs w:val="17"/>
               </w:rPr>
-              <w:t xml:space="preserve">Config parsing failed / Unexpected input: 'java'</w:t>
+              <w:t xml:space="preserve">AnnotSV needs … an existing path of the annotations directory</w:t>
             </w:r>
           </w:p>
         </w:tc>
@@ -20114,7 +20114,7 @@
                 <w:sz w:val="17"/>
                 <w:szCs w:val="17"/>
               </w:rPr>
-              <w:t xml:space="preserve">Nextflow ≥ 26.04 : syntaxe stricte, pas encore suivie par Rapid-CNS2_nf 3.0</w:t>
+              <w:t xml:space="preserve">dossier d'annotations non monté dans le conteneur Docker</w:t>
             </w:r>
           </w:p>
         </w:tc>
@@ -20146,7 +20146,7 @@
                 <w:sz w:val="17"/>
                 <w:szCs w:val="17"/>
               </w:rPr>
-              <w:t xml:space="preserve">export NXF_SYNTAX_PARSER=v1 (automatique dans l'interface et sur la clé)</w:t>
+              <w:t xml:space="preserve">interface à jour (montage automatique) ; en ligne de commande : --containerBindPaths dossier_AnnotSV,dossier_ANNOVAR</w:t>
             </w:r>
           </w:p>
         </w:tc>
@@ -20184,7 +20184,7 @@
                 <w:sz w:val="17"/>
                 <w:szCs w:val="17"/>
               </w:rPr>
-              <w:t xml:space="preserve">the stick is formatted as '…'</w:t>
+              <w:t xml:space="preserve">Config parsing failed / Unexpected input: 'java'</w:t>
             </w:r>
           </w:p>
         </w:tc>
@@ -20217,7 +20217,7 @@
                 <w:sz w:val="17"/>
                 <w:szCs w:val="17"/>
               </w:rPr>
-              <w:t xml:space="preserve">clé en FAT32 ou exFAT</w:t>
+              <w:t xml:space="preserve">Nextflow ≥ 26.04 : syntaxe stricte, pas encore suivie par Rapid-CNS2_nf 3.0</w:t>
             </w:r>
           </w:p>
         </w:tc>
@@ -20250,7 +20250,7 @@
                 <w:sz w:val="17"/>
                 <w:szCs w:val="17"/>
               </w:rPr>
-              <w:t xml:space="preserve">reformater en ext4 (section 6.8)</w:t>
+              <w:t xml:space="preserve">export NXF_SYNTAX_PARSER=v1 (automatique dans l'interface et sur la clé)</w:t>
             </w:r>
           </w:p>
         </w:tc>
@@ -20287,7 +20287,7 @@
                 <w:sz w:val="17"/>
                 <w:szCs w:val="17"/>
               </w:rPr>
-              <w:t xml:space="preserve">… is mounted on '…': … is used by the system</w:t>
+              <w:t xml:space="preserve">the stick is formatted as '…'</w:t>
             </w:r>
           </w:p>
         </w:tc>
@@ -20319,7 +20319,7 @@
                 <w:sz w:val="17"/>
                 <w:szCs w:val="17"/>
               </w:rPr>
-              <w:t xml:space="preserve">disque système ou partition montée hors de /media</w:t>
+              <w:t xml:space="preserve">clé en FAT32 ou exFAT</w:t>
             </w:r>
           </w:p>
         </w:tc>
@@ -20351,7 +20351,7 @@
                 <w:sz w:val="17"/>
                 <w:szCs w:val="17"/>
               </w:rPr>
-              <w:t xml:space="preserve">vérifier le nom avec --list ; démonter la clé si elle est montée ailleurs</w:t>
+              <w:t xml:space="preserve">reformater en ext4 (section 6.8)</w:t>
             </w:r>
           </w:p>
         </w:tc>
@@ -20389,7 +20389,7 @@
                 <w:sz w:val="17"/>
                 <w:szCs w:val="17"/>
               </w:rPr>
-              <w:t xml:space="preserve">… is neither USB nor removable</w:t>
+              <w:t xml:space="preserve">… is mounted on '…': … is used by the system</w:t>
             </w:r>
           </w:p>
         </w:tc>
@@ -20422,7 +20422,7 @@
                 <w:sz w:val="17"/>
                 <w:szCs w:val="17"/>
               </w:rPr>
-              <w:t xml:space="preserve">boîtier non signalé comme amovible</w:t>
+              <w:t xml:space="preserve">disque système ou partition montée hors de /media</w:t>
             </w:r>
           </w:p>
         </w:tc>
@@ -20455,7 +20455,7 @@
                 <w:sz w:val="17"/>
                 <w:szCs w:val="17"/>
               </w:rPr>
-              <w:t xml:space="preserve">vérifier que c'est bien la clé, puis --allow-non-removable</w:t>
+              <w:t xml:space="preserve">vérifier le nom avec --list ; démonter la clé si elle est montée ailleurs</w:t>
             </w:r>
           </w:p>
         </w:tc>
@@ -20492,7 +20492,7 @@
                 <w:sz w:val="17"/>
                 <w:szCs w:val="17"/>
               </w:rPr>
-              <w:t xml:space="preserve">… is a folder, not a mount point</w:t>
+              <w:t xml:space="preserve">… is neither USB nor removable</w:t>
             </w:r>
           </w:p>
         </w:tc>
@@ -20524,7 +20524,7 @@
                 <w:sz w:val="17"/>
                 <w:szCs w:val="17"/>
               </w:rPr>
-              <w:t xml:space="preserve">dossier qui n'est pas le point de montage d'une clé</w:t>
+              <w:t xml:space="preserve">boîtier non signalé comme amovible</w:t>
             </w:r>
           </w:p>
         </w:tc>
@@ -20556,7 +20556,7 @@
                 <w:sz w:val="17"/>
                 <w:szCs w:val="17"/>
               </w:rPr>
-              <w:t xml:space="preserve">donner le périphérique (--list) ou le dossier où la clé est montée</w:t>
+              <w:t xml:space="preserve">vérifier que c'est bien la clé, puis --allow-non-removable</w:t>
             </w:r>
           </w:p>
         </w:tc>
@@ -20594,7 +20594,7 @@
                 <w:sz w:val="17"/>
                 <w:szCs w:val="17"/>
               </w:rPr>
-              <w:t xml:space="preserve">no terminal to confirm</w:t>
+              <w:t xml:space="preserve">… is a folder, not a mount point</w:t>
             </w:r>
           </w:p>
         </w:tc>
@@ -20627,7 +20627,7 @@
                 <w:sz w:val="17"/>
                 <w:szCs w:val="17"/>
               </w:rPr>
-              <w:t xml:space="preserve">lancé sans terminal (script, cron)</w:t>
+              <w:t xml:space="preserve">dossier qui n'est pas le point de montage d'une clé</w:t>
             </w:r>
           </w:p>
         </w:tc>
@@ -20660,7 +20660,7 @@
                 <w:sz w:val="17"/>
                 <w:szCs w:val="17"/>
               </w:rPr>
-              <w:t xml:space="preserve">ajouter --yes</w:t>
+              <w:t xml:space="preserve">donner le périphérique (--list) ou le dossier où la clé est montée</w:t>
             </w:r>
           </w:p>
         </w:tc>
@@ -20697,7 +20697,7 @@
                 <w:sz w:val="17"/>
                 <w:szCs w:val="17"/>
               </w:rPr>
-              <w:t xml:space="preserve">ANNOVAR database missing or still compressed</w:t>
+              <w:t xml:space="preserve">no terminal to confirm</w:t>
             </w:r>
           </w:p>
         </w:tc>
@@ -20729,7 +20729,7 @@
                 <w:sz w:val="17"/>
                 <w:szCs w:val="17"/>
               </w:rPr>
-              <w:t xml:space="preserve">base ANNOVAR absente ou encore compressée</w:t>
+              <w:t xml:space="preserve">lancé sans terminal (script, cron)</w:t>
             </w:r>
           </w:p>
         </w:tc>
@@ -20761,7 +20761,7 @@
                 <w:sz w:val="17"/>
                 <w:szCs w:val="17"/>
               </w:rPr>
-              <w:t xml:space="preserve">décompresser les bases ou utiliser --no-annovar</w:t>
+              <w:t xml:space="preserve">ajouter --yes</w:t>
             </w:r>
           </w:p>
         </w:tc>
@@ -20793,13 +20793,13 @@
             </w:pPr>
             <w:r>
               <w:rPr>
-                <w:rFonts w:ascii="Arial" w:cs="Arial" w:eastAsia="Arial" w:hAnsi="Arial"/>
-                <w:b w:val="false"/>
-                <w:bCs w:val="false"/>
-                <w:sz w:val="17"/>
-                <w:szCs w:val="17"/>
-              </w:rPr>
-              <w:t xml:space="preserve">run.sh --check : ✘ usable container engine</w:t>
+                <w:rFonts w:ascii="Consolas" w:cs="Consolas" w:eastAsia="Consolas" w:hAnsi="Consolas"/>
+                <w:b w:val="false"/>
+                <w:bCs w:val="false"/>
+                <w:sz w:val="17"/>
+                <w:szCs w:val="17"/>
+              </w:rPr>
+              <w:t xml:space="preserve">ANNOVAR database missing or still compressed</w:t>
             </w:r>
           </w:p>
         </w:tc>
@@ -20832,7 +20832,7 @@
                 <w:sz w:val="17"/>
                 <w:szCs w:val="17"/>
               </w:rPr>
-              <w:t xml:space="preserve">ni Apptainer ni Docker sur l'hôte</w:t>
+              <w:t xml:space="preserve">base ANNOVAR absente ou encore compressée</w:t>
             </w:r>
           </w:p>
         </w:tc>
@@ -20865,7 +20865,7 @@
                 <w:sz w:val="17"/>
                 <w:szCs w:val="17"/>
               </w:rPr>
-              <w:t xml:space="preserve">installer l'un des deux ; forcer avec RCNS_ENGINE si besoin</w:t>
+              <w:t xml:space="preserve">décompresser les bases ou utiliser --no-annovar</w:t>
             </w:r>
           </w:p>
         </w:tc>
@@ -20896,13 +20896,13 @@
             </w:pPr>
             <w:r>
               <w:rPr>
-                <w:rFonts w:ascii="Consolas" w:cs="Consolas" w:eastAsia="Consolas" w:hAnsi="Consolas"/>
-                <w:b w:val="false"/>
-                <w:bCs w:val="false"/>
-                <w:sz w:val="17"/>
-                <w:szCs w:val="17"/>
-              </w:rPr>
-              <w:t xml:space="preserve">no MM:Z: tag in the FASTQ headers</w:t>
+                <w:rFonts w:ascii="Arial" w:cs="Arial" w:eastAsia="Arial" w:hAnsi="Arial"/>
+                <w:b w:val="false"/>
+                <w:bCs w:val="false"/>
+                <w:sz w:val="17"/>
+                <w:szCs w:val="17"/>
+              </w:rPr>
+              <w:t xml:space="preserve">run.sh --check : ✘ usable container engine</w:t>
             </w:r>
           </w:p>
         </w:tc>
@@ -20934,7 +20934,7 @@
                 <w:sz w:val="17"/>
                 <w:szCs w:val="17"/>
               </w:rPr>
-              <w:t xml:space="preserve">FASTQ sans méthylation</w:t>
+              <w:t xml:space="preserve">ni Apptainer ni Docker sur l'hôte</w:t>
             </w:r>
           </w:p>
         </w:tc>
@@ -20966,7 +20966,7 @@
                 <w:sz w:val="17"/>
                 <w:szCs w:val="17"/>
               </w:rPr>
-              <w:t xml:space="preserve">repartir des POD5 ou du BAM non aligné</w:t>
+              <w:t xml:space="preserve">installer l'un des deux ; forcer avec RCNS_ENGINE si besoin</w:t>
             </w:r>
           </w:p>
         </w:tc>
@@ -21004,6 +21004,109 @@
                 <w:sz w:val="17"/>
                 <w:szCs w:val="17"/>
               </w:rPr>
+              <w:t xml:space="preserve">no MM:Z: tag in the FASTQ headers</w:t>
+            </w:r>
+          </w:p>
+        </w:tc>
+        <w:tc>
+          <w:tcPr>
+            <w:tcW w:type="dxa" w:w="3000"/>
+            <w:tcBorders>
+              <w:top w:val="single" w:color="BFBFBF" w:sz="4"/>
+              <w:left w:val="single" w:color="BFBFBF" w:sz="4"/>
+              <w:bottom w:val="single" w:color="BFBFBF" w:sz="4"/>
+              <w:right w:val="single" w:color="BFBFBF" w:sz="4"/>
+            </w:tcBorders>
+            <w:shd w:fill="F5F7FA" w:color="auto" w:val="clear"/>
+            <w:tcMar>
+              <w:top w:type="dxa" w:w="60"/>
+              <w:left w:type="dxa" w:w="100"/>
+              <w:bottom w:type="dxa" w:w="60"/>
+              <w:right w:type="dxa" w:w="100"/>
+            </w:tcMar>
+          </w:tcPr>
+          <w:p>
+            <w:pPr>
+              <w:spacing w:after="0" w:line="252"/>
+            </w:pPr>
+            <w:r>
+              <w:rPr>
+                <w:rFonts w:ascii="Arial" w:cs="Arial" w:eastAsia="Arial" w:hAnsi="Arial"/>
+                <w:b w:val="false"/>
+                <w:bCs w:val="false"/>
+                <w:sz w:val="17"/>
+                <w:szCs w:val="17"/>
+              </w:rPr>
+              <w:t xml:space="preserve">FASTQ sans méthylation</w:t>
+            </w:r>
+          </w:p>
+        </w:tc>
+        <w:tc>
+          <w:tcPr>
+            <w:tcW w:type="dxa" w:w="3338"/>
+            <w:tcBorders>
+              <w:top w:val="single" w:color="BFBFBF" w:sz="4"/>
+              <w:left w:val="single" w:color="BFBFBF" w:sz="4"/>
+              <w:bottom w:val="single" w:color="BFBFBF" w:sz="4"/>
+              <w:right w:val="single" w:color="BFBFBF" w:sz="4"/>
+            </w:tcBorders>
+            <w:shd w:fill="F5F7FA" w:color="auto" w:val="clear"/>
+            <w:tcMar>
+              <w:top w:type="dxa" w:w="60"/>
+              <w:left w:type="dxa" w:w="100"/>
+              <w:bottom w:type="dxa" w:w="60"/>
+              <w:right w:type="dxa" w:w="100"/>
+            </w:tcMar>
+          </w:tcPr>
+          <w:p>
+            <w:pPr>
+              <w:spacing w:after="0" w:line="252"/>
+            </w:pPr>
+            <w:r>
+              <w:rPr>
+                <w:rFonts w:ascii="Arial" w:cs="Arial" w:eastAsia="Arial" w:hAnsi="Arial"/>
+                <w:b w:val="false"/>
+                <w:bCs w:val="false"/>
+                <w:sz w:val="17"/>
+                <w:szCs w:val="17"/>
+              </w:rPr>
+              <w:t xml:space="preserve">repartir des POD5 ou du BAM non aligné</w:t>
+            </w:r>
+          </w:p>
+        </w:tc>
+      </w:tr>
+      <w:tr>
+        <w:trPr>
+          <w:cantSplit/>
+        </w:trPr>
+        <w:tc>
+          <w:tcPr>
+            <w:tcW w:type="dxa" w:w="3300"/>
+            <w:tcBorders>
+              <w:top w:val="single" w:color="BFBFBF" w:sz="4"/>
+              <w:left w:val="single" w:color="BFBFBF" w:sz="4"/>
+              <w:bottom w:val="single" w:color="BFBFBF" w:sz="4"/>
+              <w:right w:val="single" w:color="BFBFBF" w:sz="4"/>
+            </w:tcBorders>
+            <w:tcMar>
+              <w:top w:type="dxa" w:w="60"/>
+              <w:left w:type="dxa" w:w="100"/>
+              <w:bottom w:type="dxa" w:w="60"/>
+              <w:right w:type="dxa" w:w="100"/>
+            </w:tcMar>
+          </w:tcPr>
+          <w:p>
+            <w:pPr>
+              <w:spacing w:after="0" w:line="252"/>
+            </w:pPr>
+            <w:r>
+              <w:rPr>
+                <w:rFonts w:ascii="Consolas" w:cs="Consolas" w:eastAsia="Consolas" w:hAnsi="Consolas"/>
+                <w:b w:val="false"/>
+                <w:bCs w:val="false"/>
+                <w:sz w:val="17"/>
+                <w:szCs w:val="17"/>
+              </w:rPr>
               <w:t xml:space="preserve">contig 'chr7' missing</w:t>
             </w:r>
           </w:p>
@@ -21017,7 +21120,6 @@
               <w:bottom w:val="single" w:color="BFBFBF" w:sz="4"/>
               <w:right w:val="single" w:color="BFBFBF" w:sz="4"/>
             </w:tcBorders>
-            <w:shd w:fill="F5F7FA" w:color="auto" w:val="clear"/>
             <w:tcMar>
               <w:top w:type="dxa" w:w="60"/>
               <w:left w:type="dxa" w:w="100"/>
@@ -21050,7 +21152,6 @@
               <w:bottom w:val="single" w:color="BFBFBF" w:sz="4"/>
               <w:right w:val="single" w:color="BFBFBF" w:sz="4"/>
             </w:tcBorders>
-            <w:shd w:fill="F5F7FA" w:color="auto" w:val="clear"/>
             <w:tcMar>
               <w:top w:type="dxa" w:w="60"/>
               <w:left w:type="dxa" w:w="100"/>

</xml_diff>